<commit_message>
Final sync of all remaining uncommitted files
</commit_message>
<xml_diff>
--- a/drafts/andes_virus_research_letter_v11.docx
+++ b/drafts/andes_virus_research_letter_v11.docx
@@ -365,8 +365,7 @@
       </w:r>
     </w:p>
     <w:p>
-      <w:bookmarkStart w:id="2" w:name="methods"/>
-      <w:bookmarkEnd w:id="1"/>
+      <w:bookmarkStart w:id="1" w:name="methods"/>
       <w:r>
         <w:t>Patient-level line lists detailing exposure windows, symptom onset dates, and infector-</w:t>
       </w:r>
@@ -502,196 +501,211 @@
       </w:r>
     </w:p>
     <w:p>
-      <w:bookmarkStart w:id="3" w:name="results"/>
+      <w:bookmarkStart w:id="2" w:name="results"/>
+      <w:bookmarkEnd w:id="1"/>
+      <w:r>
+        <w:t>Interval-censored MLE demonstrated a median human-to-human incubation period of 20.1 days</w:t>
+      </w:r>
+      <w:r>
+        <w:t xml:space="preserve"> (IQR 14.8-27.2)</w:t>
+      </w:r>
+      <w:r>
+        <w:t xml:space="preserve"> and environmental </w:t>
+      </w:r>
+      <w:r>
+        <w:t>(rodent-to-human) incubation period</w:t>
+      </w:r>
+      <w:r>
+        <w:t xml:space="preserve"> of</w:t>
+      </w:r>
+      <w:r>
+        <w:t xml:space="preserve"> 18.5 days</w:t>
+      </w:r>
+      <w:r>
+        <w:t xml:space="preserve"> </w:t>
+      </w:r>
+      <w:r>
+        <w:t>(</w:t>
+      </w:r>
+      <w:r>
+        <w:t>IQR 13.8-24.7</w:t>
+      </w:r>
+      <w:r>
+        <w:t xml:space="preserve">) [6]. </w:t>
+      </w:r>
+      <w:r>
+        <w:t>The</w:t>
+      </w:r>
+      <w:r>
+        <w:t xml:space="preserve"> </w:t>
+      </w:r>
+      <w:r>
+        <w:t xml:space="preserve">resulting density distributions </w:t>
+      </w:r>
+      <w:r>
+        <w:t xml:space="preserve">were </w:t>
+      </w:r>
+      <w:r>
+        <w:t xml:space="preserve">very </w:t>
+      </w:r>
+      <w:r>
+        <w:t>similar</w:t>
+      </w:r>
+      <w:r>
+        <w:t xml:space="preserve"> (Figure 1A), </w:t>
+      </w:r>
+      <w:r>
+        <w:t>demonstrating</w:t>
+      </w:r>
+      <w:r>
+        <w:t xml:space="preserve"> that the prolonged incubation period is intrinsic to ANDV pathogenesis</w:t>
+      </w:r>
+      <w:r>
+        <w:t xml:space="preserve"> and not specific to exposure route</w:t>
+      </w:r>
+      <w:r>
+        <w:t>.</w:t>
+      </w:r>
+      <w:r>
+        <w:t xml:space="preserve"> </w:t>
+      </w:r>
+      <w:r>
+        <w:t xml:space="preserve">Analysis of the empirical generation time curves revealed that approximately 24% of transmission occurs during </w:t>
+      </w:r>
+      <w:r>
+        <w:t>a</w:t>
+      </w:r>
+      <w:r>
+        <w:t xml:space="preserve"> presymptomatic</w:t>
+      </w:r>
+      <w:r>
+        <w:t>, subclinical,</w:t>
+      </w:r>
+      <w:r>
+        <w:t xml:space="preserve"> or early prodromal phase, prior to the onset of severe febrile illness (Figure 1B).</w:t>
+      </w:r>
+    </w:p>
+    <w:p>
+      <w:r>
+        <w:t>The empirical offspring distribution (Figure 1C) highlights the preponderance of zero or single secondary cases juxtaposed against rare superspreading events. To quantify this transmission heterogeneity, we fit a negative binomial model to the combined data, yielding an overall  of 0.96, but low dispersion parameter (</w:t>
+      </w:r>
+      <m:oMath>
+        <m:r>
+          <w:rPr>
+            <w:rFonts w:ascii="Cambria Math" w:hAnsi="Cambria Math"/>
+          </w:rPr>
+          <m:t>k</m:t>
+        </m:r>
+      </m:oMath>
+      <w:r>
+        <w:t xml:space="preserve">) of 0.24. Using the framework by Lloyd-Smith et al. [5], we plotted the proportion of transmission driven by the most infectious cases (Figure 1D). This confirms extreme heterogeneity: the top 20% of infectious individuals generate an estimated 81% of all secondary infections. In branching process simulations, we found that 69% of single-case introductions resulted in immediate stochastic extinction (generating zero secondary cases) and 13% generated a </w:t>
+      </w:r>
+      <w:r>
+        <w:lastRenderedPageBreak/>
+        <w:t>single secondary case. However, outbreaks that evaded early extinction had a small probability of explosive growth (Supplementary Figure S2).</w:t>
+      </w:r>
+    </w:p>
+    <w:p>
+      <w:bookmarkStart w:id="3" w:name="discussion"/>
       <w:bookmarkEnd w:id="2"/>
       <w:r>
-        <w:t>Interval-censored MLE demonstrated a median human-to-human incubation period of 20.1 days</w:t>
-      </w:r>
-      <w:r>
-        <w:t xml:space="preserve"> (IQR 14.8-27.2)</w:t>
-      </w:r>
-      <w:r>
-        <w:t xml:space="preserve"> and environmental </w:t>
-      </w:r>
-      <w:r>
-        <w:t>(rodent-to-human) incubation period</w:t>
-      </w:r>
-      <w:r>
-        <w:t xml:space="preserve"> of</w:t>
-      </w:r>
-      <w:r>
-        <w:t xml:space="preserve"> 18.5 days</w:t>
+        <w:t xml:space="preserve">These epidemiological characteristics complicate </w:t>
+      </w:r>
+      <w:r>
+        <w:t>managing outbreaks</w:t>
+      </w:r>
+      <w:r>
+        <w:t xml:space="preserve"> in high-density settings such as a cruise ship. A prolonged incubation period combined with </w:t>
+      </w:r>
+      <w:r>
+        <w:t xml:space="preserve">either </w:t>
+      </w:r>
+      <w:r>
+        <w:t>presymptomatic</w:t>
+      </w:r>
+      <w:r>
+        <w:t xml:space="preserve">, </w:t>
+      </w:r>
+      <w:r>
+        <w:t>subclinical</w:t>
+      </w:r>
+      <w:r>
+        <w:t xml:space="preserve">, or prodromal </w:t>
+      </w:r>
+      <w:r>
+        <w:t>shedding limits the effectiveness of symptom-based screening, as secondary transmission may occur before overt symptoms emerge</w:t>
+      </w:r>
+      <w:r>
+        <w:t>.</w:t>
       </w:r>
       <w:r>
         <w:t xml:space="preserve"> </w:t>
       </w:r>
       <w:r>
-        <w:t>(</w:t>
-      </w:r>
-      <w:r>
-        <w:t>IQR 13.8-24.7</w:t>
-      </w:r>
-      <w:r>
-        <w:t xml:space="preserve">) [6]. </w:t>
-      </w:r>
-      <w:r>
-        <w:t>The</w:t>
-      </w:r>
-      <w:r>
-        <w:t xml:space="preserve"> </w:t>
-      </w:r>
-      <w:r>
-        <w:t xml:space="preserve">resulting density distributions </w:t>
-      </w:r>
-      <w:r>
-        <w:t xml:space="preserve">were </w:t>
-      </w:r>
-      <w:r>
-        <w:t xml:space="preserve">very </w:t>
-      </w:r>
-      <w:r>
-        <w:t>similar</w:t>
-      </w:r>
-      <w:r>
-        <w:t xml:space="preserve"> (Figure 1A), </w:t>
-      </w:r>
-      <w:r>
-        <w:t>demonstrating</w:t>
-      </w:r>
-      <w:r>
-        <w:t xml:space="preserve"> that the prolonged incubation period is intrinsic to ANDV pathogenesis</w:t>
-      </w:r>
-      <w:r>
-        <w:t xml:space="preserve"> and not specific to exposure route</w:t>
+        <w:t xml:space="preserve">Longer (e.g. 42 day) isolation or </w:t>
+      </w:r>
+      <w:r>
+        <w:t>q</w:t>
+      </w:r>
+      <w:r>
+        <w:t xml:space="preserve">uarantine of exposed individuals with </w:t>
+      </w:r>
+      <w:r>
+        <w:t xml:space="preserve">periodic testing irrespective of symptoms </w:t>
+      </w:r>
+      <w:r>
+        <w:t xml:space="preserve">would </w:t>
+      </w:r>
+      <w:r>
+        <w:t>minimiz</w:t>
+      </w:r>
+      <w:r>
+        <w:t>e</w:t>
+      </w:r>
+      <w:r>
+        <w:t xml:space="preserve"> exposure to others</w:t>
+      </w:r>
+      <w:r>
+        <w:t xml:space="preserve">. </w:t>
+      </w:r>
+      <w:r>
+        <w:t xml:space="preserve">Because most infected individuals do not transmit the virus, </w:t>
+      </w:r>
+      <w:r>
+        <w:t xml:space="preserve">much </w:t>
+      </w:r>
+      <w:r>
+        <w:t>large</w:t>
+      </w:r>
+      <w:r>
+        <w:t>r</w:t>
+      </w:r>
+      <w:r>
+        <w:t xml:space="preserve"> uncontained outbreaks are statistically unlikely. Branching process simulations show that most introductions end in rapid stochastic extinction, making </w:t>
+      </w:r>
+      <w:r>
+        <w:t>sustained</w:t>
+      </w:r>
+      <w:r>
+        <w:t xml:space="preserve"> spread improbable despite the risk of localized superspreading events</w:t>
+      </w:r>
+      <w:r>
+        <w:t xml:space="preserve"> in </w:t>
+      </w:r>
+      <w:r>
+        <w:t>higher-risk</w:t>
+      </w:r>
+      <w:r>
+        <w:t xml:space="preserve"> environments</w:t>
       </w:r>
       <w:r>
         <w:t>.</w:t>
       </w:r>
-      <w:r>
-        <w:t xml:space="preserve"> </w:t>
-      </w:r>
-      <w:r>
-        <w:t xml:space="preserve">Analysis of the empirical generation time curves revealed that approximately 24% of transmission occurs during </w:t>
-      </w:r>
-      <w:r>
-        <w:t>a</w:t>
-      </w:r>
-      <w:r>
-        <w:t xml:space="preserve"> presymptomatic</w:t>
-      </w:r>
-      <w:r>
-        <w:t>, subclinical,</w:t>
-      </w:r>
-      <w:r>
-        <w:t xml:space="preserve"> or early prodromal phase, prior to the onset of severe febrile illness (Figure 1B).</w:t>
-      </w:r>
-    </w:p>
-    <w:p>
-      <w:r>
-        <w:t>The empirical offspring distribution (Figure 1C) highlights the preponderance of zero or single secondary cases juxtaposed against rare superspreading events. To quantify this transmission heterogeneity, we fit a negative binomial model to the combined data, yielding an overall  of 0.96, but low dispersion parameter () of 0.24. Using the framework by Lloyd-Smith et al. [5], we plotted the proportion of transmission driven by the most infectious cases (Figure 1D). This confirms extreme heterogeneity: the top 20% of infectious individuals generate an estimated 81% of all secondary infections. In branching process simulations, we found that 69% of single-case introductions resulted in immediate stochastic extinction (generating zero secondary cases) and 13% generated a single secondary case. However, outbreaks that evaded early extinction had a small probability of explosive growth (Supplementary Figure S2).</w:t>
-      </w:r>
-    </w:p>
-    <w:p>
-      <w:bookmarkStart w:id="4" w:name="discussion"/>
+    </w:p>
+    <w:p/>
+    <w:p>
+      <w:bookmarkStart w:id="4" w:name="references"/>
       <w:bookmarkEnd w:id="3"/>
-      <w:r>
-        <w:t xml:space="preserve">These epidemiological characteristics complicate </w:t>
-      </w:r>
-      <w:r>
-        <w:t>managing outbreaks</w:t>
-      </w:r>
-      <w:r>
-        <w:t xml:space="preserve"> in high-density settings such as a cruise ship. A prolonged incubation period combined with </w:t>
-      </w:r>
-      <w:r>
-        <w:t xml:space="preserve">either </w:t>
-      </w:r>
-      <w:r>
-        <w:t>presymptomatic</w:t>
-      </w:r>
-      <w:r>
-        <w:t xml:space="preserve">, </w:t>
-      </w:r>
-      <w:r>
-        <w:t>subclinical</w:t>
-      </w:r>
-      <w:r>
-        <w:t xml:space="preserve">, or prodromal </w:t>
-      </w:r>
-      <w:r>
-        <w:t>shedding limits the effectiveness of symptom-based screening, as secondary transmission may occur before overt symptoms emerge</w:t>
-      </w:r>
-      <w:r>
-        <w:t>.</w:t>
-      </w:r>
-      <w:r>
-        <w:t xml:space="preserve"> </w:t>
-      </w:r>
-      <w:r>
-        <w:t xml:space="preserve">Longer (e.g. 42 day) isolation or </w:t>
-      </w:r>
-      <w:r>
-        <w:t>q</w:t>
-      </w:r>
-      <w:r>
-        <w:t xml:space="preserve">uarantine of exposed individuals with </w:t>
-      </w:r>
-      <w:r>
-        <w:t xml:space="preserve">periodic testing irrespective of symptoms </w:t>
-      </w:r>
-      <w:r>
-        <w:t xml:space="preserve">would </w:t>
-      </w:r>
-      <w:r>
-        <w:t>minimiz</w:t>
-      </w:r>
-      <w:r>
-        <w:t>e</w:t>
-      </w:r>
-      <w:r>
-        <w:t xml:space="preserve"> exposure to others</w:t>
-      </w:r>
-      <w:r>
-        <w:t xml:space="preserve">. </w:t>
-      </w:r>
-      <w:r>
-        <w:t xml:space="preserve">Because most infected individuals do not transmit the virus, </w:t>
-      </w:r>
-      <w:r>
-        <w:t xml:space="preserve">much </w:t>
-      </w:r>
-      <w:r>
-        <w:t>large</w:t>
-      </w:r>
-      <w:r>
-        <w:t>r</w:t>
-      </w:r>
-      <w:r>
-        <w:t xml:space="preserve"> uncontained outbreaks are statistically unlikely. Branching process simulations show that most introductions end in rapid stochastic extinction, making </w:t>
-      </w:r>
-      <w:r>
-        <w:t>sustained</w:t>
-      </w:r>
-      <w:r>
-        <w:t xml:space="preserve"> spread improbable despite the risk of localized superspreading events</w:t>
-      </w:r>
-      <w:r>
-        <w:t xml:space="preserve"> in </w:t>
-      </w:r>
-      <w:r>
-        <w:t>higher-risk</w:t>
-      </w:r>
-      <w:r>
-        <w:t xml:space="preserve"> environments</w:t>
-      </w:r>
-      <w:r>
-        <w:t>.</w:t>
-      </w:r>
-    </w:p>
-    <w:p/>
-    <w:p>
-      <w:bookmarkStart w:id="5" w:name="references"/>
-      <w:bookmarkEnd w:id="4"/>
       <w:r>
         <w:rPr>
           <w:b/>
@@ -795,8 +809,8 @@
           <w:color w:val="000000" w:themeColor="text1"/>
         </w:rPr>
       </w:pPr>
-      <w:bookmarkStart w:id="6" w:name="figures-and-legends"/>
-      <w:bookmarkEnd w:id="5"/>
+      <w:bookmarkStart w:id="5" w:name="figures-and-legends"/>
+      <w:bookmarkEnd w:id="4"/>
       <w:r>
         <w:rPr>
           <w:rFonts w:ascii="Calibri" w:hAnsi="Calibri" w:cs="Calibri"/>
@@ -937,9 +951,9 @@
           <w:color w:val="000000" w:themeColor="text1"/>
         </w:rPr>
       </w:pPr>
-      <w:bookmarkStart w:id="7" w:name="supplementary-appendices"/>
+      <w:bookmarkStart w:id="6" w:name="supplementary-appendices"/>
       <w:bookmarkEnd w:id="0"/>
-      <w:bookmarkEnd w:id="6"/>
+      <w:bookmarkEnd w:id="5"/>
       <w:r>
         <w:rPr>
           <w:rFonts w:ascii="Calibri" w:hAnsi="Calibri" w:cs="Calibri"/>
@@ -987,7 +1001,7 @@
           <w:szCs w:val="24"/>
         </w:rPr>
       </w:pPr>
-      <w:bookmarkStart w:id="8" w:name="Xe536cde35c1e33aa0946ff7d626dcf93c8e3a7d"/>
+      <w:bookmarkStart w:id="7" w:name="Xe536cde35c1e33aa0946ff7d626dcf93c8e3a7d"/>
       <w:r>
         <w:rPr>
           <w:rFonts w:ascii="Calibri" w:hAnsi="Calibri" w:cs="Calibri"/>
@@ -1175,8 +1189,8 @@
           <w:szCs w:val="24"/>
         </w:rPr>
       </w:pPr>
-      <w:bookmarkStart w:id="9" w:name="X6dadb0cfcccd537fb3c1039059a04313178fd6a"/>
-      <w:bookmarkEnd w:id="8"/>
+      <w:bookmarkStart w:id="8" w:name="X6dadb0cfcccd537fb3c1039059a04313178fd6a"/>
+      <w:bookmarkEnd w:id="7"/>
       <w:r>
         <w:rPr>
           <w:rFonts w:ascii="Calibri" w:hAnsi="Calibri" w:cs="Calibri"/>
@@ -1450,8 +1464,8 @@
           <w:szCs w:val="24"/>
         </w:rPr>
       </w:pPr>
-      <w:bookmarkStart w:id="10" w:name="appendix-c-demographic-stratification"/>
-      <w:bookmarkEnd w:id="9"/>
+      <w:bookmarkStart w:id="9" w:name="appendix-c-demographic-stratification"/>
+      <w:bookmarkEnd w:id="8"/>
       <w:r>
         <w:rPr>
           <w:rFonts w:ascii="Calibri" w:hAnsi="Calibri" w:cs="Calibri"/>
@@ -1592,8 +1606,8 @@
         </w:rPr>
         <w:t xml:space="preserve"> outbreak.</w:t>
       </w:r>
-      <w:bookmarkEnd w:id="7"/>
-      <w:bookmarkEnd w:id="10"/>
+      <w:bookmarkEnd w:id="6"/>
+      <w:bookmarkEnd w:id="9"/>
     </w:p>
     <w:sectPr>
       <w:footnotePr>

</xml_diff>